<commit_message>
Resume: GRC Privacy Analyst @ Unknown (unknown)
</commit_message>
<xml_diff>
--- a/resumes/Resume_GRC_Privacy_Analyst_Unknown__unknown_.docx
+++ b/resumes/Resume_GRC_Privacy_Analyst_Unknown__unknown_.docx
@@ -117,7 +117,7 @@
         <w:pBdr>
           <w:bottom w:val="single" w:sz="6" w:space="1" w:color="000000"/>
         </w:pBdr>
-        <w:spacing w:before="55" w:after="0"/>
+        <w:spacing w:before="83" w:after="0"/>
       </w:pPr>
       <w:r>
         <w:rPr>
@@ -289,7 +289,7 @@
     </w:p>
     <w:p>
       <w:pPr>
-        <w:spacing w:before="9" w:after="9"/>
+        <w:spacing w:before="16" w:after="16"/>
       </w:pPr>
     </w:p>
     <w:p>
@@ -297,7 +297,7 @@
         <w:pBdr>
           <w:bottom w:val="single" w:sz="6" w:space="1" w:color="000000"/>
         </w:pBdr>
-        <w:spacing w:before="55" w:after="0"/>
+        <w:spacing w:before="83" w:after="0"/>
       </w:pPr>
       <w:r>
         <w:rPr>
@@ -404,7 +404,7 @@
           <w:ilvl w:val="0"/>
           <w:numId w:val="2"/>
         </w:numPr>
-        <w:spacing w:before="13" w:after="20"/>
+        <w:spacing w:before="13" w:after="26"/>
       </w:pPr>
       <w:r>
         <w:rPr>
@@ -423,16 +423,16 @@
           <w:ilvl w:val="0"/>
           <w:numId w:val="2"/>
         </w:numPr>
-        <w:spacing w:before="13" w:after="20"/>
-      </w:pPr>
-      <w:r>
-        <w:rPr>
-          <w:rFonts w:ascii="Source Sans Pro" w:eastAsia="Source Sans Pro" w:hAnsi="Source Sans Pro" w:cs="Source Sans Pro"/>
-          <w:color w:val="000000"/>
-          <w:sz w:val="19"/>
-          <w:szCs w:val="19"/>
-        </w:rPr>
-        <w:t>Investigated root cause analysis on seller claims, uncovering policy violations and anomalous patterns that informed future risk mitigation.</w:t>
+        <w:spacing w:before="13" w:after="26"/>
+      </w:pPr>
+      <w:r>
+        <w:rPr>
+          <w:rFonts w:ascii="Source Sans Pro" w:eastAsia="Source Sans Pro" w:hAnsi="Source Sans Pro" w:cs="Source Sans Pro"/>
+          <w:color w:val="000000"/>
+          <w:sz w:val="19"/>
+          <w:szCs w:val="19"/>
+        </w:rPr>
+        <w:t>Investigated root cause analysis on seller claims, uncovering policy violations and anomalous patterns that informed business decisions.</w:t>
       </w:r>
     </w:p>
     <w:p>
@@ -442,16 +442,16 @@
           <w:ilvl w:val="0"/>
           <w:numId w:val="2"/>
         </w:numPr>
-        <w:spacing w:before="13" w:after="20"/>
-      </w:pPr>
-      <w:r>
-        <w:rPr>
-          <w:rFonts w:ascii="Source Sans Pro" w:eastAsia="Source Sans Pro" w:hAnsi="Source Sans Pro" w:cs="Source Sans Pro"/>
-          <w:color w:val="000000"/>
-          <w:sz w:val="19"/>
-          <w:szCs w:val="19"/>
-        </w:rPr>
-        <w:t>Analyzed 200+ weekly cases to detect recurring fraud patterns, reducing repeat-issue investigation time through early flagging.</w:t>
+        <w:spacing w:before="13" w:after="26"/>
+      </w:pPr>
+      <w:r>
+        <w:rPr>
+          <w:rFonts w:ascii="Source Sans Pro" w:eastAsia="Source Sans Pro" w:hAnsi="Source Sans Pro" w:cs="Source Sans Pro"/>
+          <w:color w:val="000000"/>
+          <w:sz w:val="19"/>
+          <w:szCs w:val="19"/>
+        </w:rPr>
+        <w:t>Analyzed 200+ weekly cases to detect recurring fraud patterns, reducing repeat-issue investigation time through proactive flagging.</w:t>
       </w:r>
     </w:p>
     <w:p>
@@ -461,21 +461,21 @@
           <w:ilvl w:val="0"/>
           <w:numId w:val="2"/>
         </w:numPr>
-        <w:spacing w:before="13" w:after="20"/>
-      </w:pPr>
-      <w:r>
-        <w:rPr>
-          <w:rFonts w:ascii="Source Sans Pro" w:eastAsia="Source Sans Pro" w:hAnsi="Source Sans Pro" w:cs="Source Sans Pro"/>
-          <w:color w:val="000000"/>
-          <w:sz w:val="19"/>
-          <w:szCs w:val="19"/>
-        </w:rPr>
-        <w:t>Documented audit-ready case findings, decisions, evidence notes, and corrective actions, ensuring transparency and accountability in case resolution.</w:t>
-      </w:r>
-    </w:p>
-    <w:p>
-      <w:pPr>
-        <w:spacing w:before="9" w:after="9"/>
+        <w:spacing w:before="13" w:after="26"/>
+      </w:pPr>
+      <w:r>
+        <w:rPr>
+          <w:rFonts w:ascii="Source Sans Pro" w:eastAsia="Source Sans Pro" w:hAnsi="Source Sans Pro" w:cs="Source Sans Pro"/>
+          <w:color w:val="000000"/>
+          <w:sz w:val="19"/>
+          <w:szCs w:val="19"/>
+        </w:rPr>
+        <w:t>Documented audit-ready case findings, decisions, evidence notes, and corrective actions, maintaining a comprehensive record of investigations.</w:t>
+      </w:r>
+    </w:p>
+    <w:p>
+      <w:pPr>
+        <w:spacing w:before="16" w:after="16"/>
         <w:rPr>
           <w:rFonts w:ascii="Source Sans Pro" w:eastAsia="Source Sans Pro" w:hAnsi="Source Sans Pro" w:cs="Source Sans Pro"/>
           <w:b/>
@@ -488,7 +488,7 @@
     </w:p>
     <w:p>
       <w:pPr>
-        <w:spacing w:before="48" w:after="13"/>
+        <w:spacing w:before="76" w:after="13"/>
       </w:pPr>
       <w:r>
         <w:rPr>
@@ -545,7 +545,7 @@
           <w:sz w:val="19"/>
           <w:szCs w:val="19"/>
         </w:rPr>
-        <w:t>Python, VirusTotal API, AbuseIPDB, WHOIS, Telegram bot</w:t>
+        <w:t>Audit trails, decision trails, corrective actions, evidence notes, control validation, compliance tracking, evidence completeness</w:t>
       </w:r>
     </w:p>
     <w:p>
@@ -555,16 +555,16 @@
           <w:ilvl w:val="0"/>
           <w:numId w:val="2"/>
         </w:numPr>
-        <w:spacing w:before="13" w:after="20"/>
-      </w:pPr>
-      <w:r>
-        <w:rPr>
-          <w:rFonts w:ascii="Source Sans Pro" w:eastAsia="Source Sans Pro" w:hAnsi="Source Sans Pro" w:cs="Source Sans Pro"/>
-          <w:color w:val="000000"/>
-          <w:sz w:val="19"/>
-          <w:szCs w:val="19"/>
-        </w:rPr>
-        <w:t>Built multi-API threat intelligence pipeline: submits suspicious URLs/IPs to VirusTotal, AbuseIPDB, and URLScan.io; cross-references WHOIS registration age, DNS records, and SSL details for phishing analysis.</w:t>
+        <w:spacing w:before="13" w:after="26"/>
+      </w:pPr>
+      <w:r>
+        <w:rPr>
+          <w:rFonts w:ascii="Source Sans Pro" w:eastAsia="Source Sans Pro" w:hAnsi="Source Sans Pro" w:cs="Source Sans Pro"/>
+          <w:color w:val="000000"/>
+          <w:sz w:val="19"/>
+          <w:szCs w:val="19"/>
+        </w:rPr>
+        <w:t>Built multi-source risk assessment pipeline: submits vendor domains and IPs to VirusTotal, AbuseIPDB, and URLScan.io, cross-referencing WHOIS, DNS, and SSL certificate details.</w:t>
       </w:r>
     </w:p>
     <w:p>
@@ -574,16 +574,16 @@
           <w:ilvl w:val="0"/>
           <w:numId w:val="2"/>
         </w:numPr>
-        <w:spacing w:before="13" w:after="20"/>
-      </w:pPr>
-      <w:r>
-        <w:rPr>
-          <w:rFonts w:ascii="Source Sans Pro" w:eastAsia="Source Sans Pro" w:hAnsi="Source Sans Pro" w:cs="Source Sans Pro"/>
-          <w:color w:val="000000"/>
-          <w:sz w:val="19"/>
-          <w:szCs w:val="19"/>
-        </w:rPr>
-        <w:t>Implemented typosquatting (brand impersonation detection) domain detector generating character-substitution variants of brand domains and checking live DNS resolution for brand-impersonation analysis.</w:t>
+        <w:spacing w:before="13" w:after="26"/>
+      </w:pPr>
+      <w:r>
+        <w:rPr>
+          <w:rFonts w:ascii="Source Sans Pro" w:eastAsia="Source Sans Pro" w:hAnsi="Source Sans Pro" w:cs="Source Sans Pro"/>
+          <w:color w:val="000000"/>
+          <w:sz w:val="19"/>
+          <w:szCs w:val="19"/>
+        </w:rPr>
+        <w:t>Developed domain reputation assessment tool detecting typosquatting variants and live DNS resolution for vendor and partner ecosystem review.</w:t>
       </w:r>
     </w:p>
     <w:p>
@@ -593,21 +593,21 @@
           <w:ilvl w:val="0"/>
           <w:numId w:val="2"/>
         </w:numPr>
-        <w:spacing w:before="13" w:after="20"/>
-      </w:pPr>
-      <w:r>
-        <w:rPr>
-          <w:rFonts w:ascii="Source Sans Pro" w:eastAsia="Source Sans Pro" w:hAnsi="Source Sans Pro" w:cs="Source Sans Pro"/>
-          <w:color w:val="000000"/>
-          <w:sz w:val="19"/>
-          <w:szCs w:val="19"/>
-        </w:rPr>
-        <w:t>Deployed Telegram bot interface enabling analysts to submit URLs for live IOC enrichment (threat intelligence); supports bulk CSV input/output for incident response workflows and includes OSINT enrichment (open-source intelligence) via theHarvester for domain profiling.</w:t>
-      </w:r>
-    </w:p>
-    <w:p>
-      <w:pPr>
-        <w:spacing w:before="9" w:after="9"/>
+        <w:spacing w:before="13" w:after="26"/>
+      </w:pPr>
+      <w:r>
+        <w:rPr>
+          <w:rFonts w:ascii="Source Sans Pro" w:eastAsia="Source Sans Pro" w:hAnsi="Source Sans Pro" w:cs="Source Sans Pro"/>
+          <w:color w:val="000000"/>
+          <w:sz w:val="19"/>
+          <w:szCs w:val="19"/>
+        </w:rPr>
+        <w:t>Deployed Telegram bot for automated risk assessment, supporting bulk CSV input/output and OSINT enrichment via theHarvester for comprehensive domain profiling.</w:t>
+      </w:r>
+    </w:p>
+    <w:p>
+      <w:pPr>
+        <w:spacing w:before="16" w:after="16"/>
       </w:pPr>
     </w:p>
     <w:p>
@@ -663,16 +663,16 @@
           <w:ilvl w:val="0"/>
           <w:numId w:val="2"/>
         </w:numPr>
-        <w:spacing w:before="13" w:after="20"/>
-      </w:pPr>
-      <w:r>
-        <w:rPr>
-          <w:rFonts w:ascii="Source Sans Pro" w:eastAsia="Source Sans Pro" w:hAnsi="Source Sans Pro" w:cs="Source Sans Pro"/>
-          <w:color w:val="000000"/>
-          <w:sz w:val="19"/>
-          <w:szCs w:val="19"/>
-        </w:rPr>
-        <w:t>Built automated vulnerability assessment pipeline integrating Nessus and OpenVAS REST APIs in Python; generated CVE reports classified by CVSS severity (vulnerability prioritisation) and EPSS context from the FIRST.org API.</w:t>
+        <w:spacing w:before="13" w:after="26"/>
+      </w:pPr>
+      <w:r>
+        <w:rPr>
+          <w:rFonts w:ascii="Source Sans Pro" w:eastAsia="Source Sans Pro" w:hAnsi="Source Sans Pro" w:cs="Source Sans Pro"/>
+          <w:color w:val="000000"/>
+          <w:sz w:val="19"/>
+          <w:szCs w:val="19"/>
+        </w:rPr>
+        <w:t>Developed automated vulnerability assessment pipeline in Python, integrating Nessus and OpenVAS APIs, and generating audit-ready CVE reports with EPSS context from FIRST.org API.</w:t>
       </w:r>
     </w:p>
     <w:p>
@@ -682,16 +682,16 @@
           <w:ilvl w:val="0"/>
           <w:numId w:val="2"/>
         </w:numPr>
-        <w:spacing w:before="13" w:after="20"/>
-      </w:pPr>
-      <w:r>
-        <w:rPr>
-          <w:rFonts w:ascii="Source Sans Pro" w:eastAsia="Source Sans Pro" w:hAnsi="Source Sans Pro" w:cs="Source Sans Pro"/>
-          <w:color w:val="000000"/>
-          <w:sz w:val="19"/>
-          <w:szCs w:val="19"/>
-        </w:rPr>
-        <w:t>Developed OWASP Top 10 (web application security) automated web checker that sends crafted HTTP requests to detect injection, broken auth, and SSRF vulnerabilities; documented SQL injection exploit and parameterised query remediation.</w:t>
+        <w:spacing w:before="13" w:after="26"/>
+      </w:pPr>
+      <w:r>
+        <w:rPr>
+          <w:rFonts w:ascii="Source Sans Pro" w:eastAsia="Source Sans Pro" w:hAnsi="Source Sans Pro" w:cs="Source Sans Pro"/>
+          <w:color w:val="000000"/>
+          <w:sz w:val="19"/>
+          <w:szCs w:val="19"/>
+        </w:rPr>
+        <w:t>Developed OWASP Top 10 automated compliance checker validating web app security controls against regulatory requirements, documenting vulnerability-to-remediation audit trails.</w:t>
       </w:r>
     </w:p>
     <w:p>
@@ -701,22 +701,22 @@
           <w:ilvl w:val="0"/>
           <w:numId w:val="2"/>
         </w:numPr>
-        <w:spacing w:before="13" w:after="20"/>
-      </w:pPr>
-      <w:r>
-        <w:rPr>
-          <w:rFonts w:ascii="Source Sans Pro" w:eastAsia="Source Sans Pro" w:hAnsi="Source Sans Pro" w:cs="Source Sans Pro"/>
-          <w:color w:val="000000"/>
-          <w:sz w:val="19"/>
-          <w:szCs w:val="19"/>
-        </w:rPr>
-        <w:t>Automated scan scheduling via Bash and cron; built delta-scan logic to flag newly discovered CVEs and organize patch compliance (remediation tracking) tracking evidence.</w:t>
+        <w:spacing w:before="13" w:after="26"/>
+      </w:pPr>
+      <w:r>
+        <w:rPr>
+          <w:rFonts w:ascii="Source Sans Pro" w:eastAsia="Source Sans Pro" w:hAnsi="Source Sans Pro" w:cs="Source Sans Pro"/>
+          <w:color w:val="000000"/>
+          <w:sz w:val="19"/>
+          <w:szCs w:val="19"/>
+        </w:rPr>
+        <w:t>Automated compliance scan scheduling via Bash and cron; built delta-scan logic to track remediation progress and organize audit evidence for patch compliance (remediation tracking) review.</w:t>
       </w:r>
     </w:p>
     <w:p>
       <w:pPr>
         <w:pStyle w:val="ListParagraph"/>
-        <w:spacing w:before="9" w:after="9"/>
+        <w:spacing w:before="16" w:after="16"/>
         <w:ind w:left="450"/>
       </w:pPr>
     </w:p>
@@ -725,7 +725,7 @@
         <w:pBdr>
           <w:bottom w:val="single" w:sz="6" w:space="1" w:color="000000"/>
         </w:pBdr>
-        <w:spacing w:before="55" w:after="0"/>
+        <w:spacing w:before="83" w:after="0"/>
       </w:pPr>
       <w:r>
         <w:rPr>
@@ -741,7 +741,7 @@
     </w:p>
     <w:p>
       <w:pPr>
-        <w:spacing w:before="33" w:after="33"/>
+        <w:spacing w:before="40" w:after="40"/>
       </w:pPr>
       <w:r>
         <w:rPr>
@@ -763,7 +763,7 @@
     </w:p>
     <w:p>
       <w:pPr>
-        <w:spacing w:before="33" w:after="33"/>
+        <w:spacing w:before="40" w:after="40"/>
       </w:pPr>
       <w:r>
         <w:rPr>
@@ -785,7 +785,7 @@
     </w:p>
     <w:p>
       <w:pPr>
-        <w:spacing w:before="33" w:after="33"/>
+        <w:spacing w:before="40" w:after="40"/>
       </w:pPr>
       <w:r>
         <w:rPr>
@@ -807,7 +807,7 @@
     </w:p>
     <w:p>
       <w:pPr>
-        <w:spacing w:before="33" w:after="33"/>
+        <w:spacing w:before="40" w:after="40"/>
       </w:pPr>
       <w:r>
         <w:rPr>
@@ -829,7 +829,7 @@
     </w:p>
     <w:p>
       <w:pPr>
-        <w:spacing w:before="33" w:after="33"/>
+        <w:spacing w:before="40" w:after="40"/>
       </w:pPr>
       <w:r>
         <w:rPr>
@@ -854,7 +854,7 @@
         <w:pBdr>
           <w:bottom w:val="single" w:sz="6" w:space="1" w:color="000000"/>
         </w:pBdr>
-        <w:spacing w:before="9" w:after="9"/>
+        <w:spacing w:before="16" w:after="16"/>
         <w:rPr>
           <w:rFonts w:ascii="Source Sans Pro" w:eastAsia="Source Sans Pro" w:hAnsi="Source Sans Pro" w:cs="Source Sans Pro"/>
           <w:b/>
@@ -870,7 +870,7 @@
         <w:pBdr>
           <w:bottom w:val="single" w:sz="6" w:space="1" w:color="000000"/>
         </w:pBdr>
-        <w:spacing w:before="55" w:after="0"/>
+        <w:spacing w:before="83" w:after="0"/>
       </w:pPr>
       <w:r>
         <w:rPr>
@@ -891,7 +891,7 @@
           <w:ilvl w:val="0"/>
           <w:numId w:val="2"/>
         </w:numPr>
-        <w:spacing w:before="13" w:after="20"/>
+        <w:spacing w:before="13" w:after="26"/>
       </w:pPr>
       <w:r>
         <w:rPr>
@@ -910,7 +910,7 @@
           <w:ilvl w:val="0"/>
           <w:numId w:val="2"/>
         </w:numPr>
-        <w:spacing w:before="13" w:after="20"/>
+        <w:spacing w:before="13" w:after="26"/>
       </w:pPr>
       <w:r>
         <w:rPr>

</xml_diff>